<commit_message>
Complete line-level audit (1,248 units), verify 214 external notes, add F-78..F-87, rebuild memo (docx+pdf), register and ledger
Co-Authored-By: Claude Opus 5.5 <noreply@anthropic.com>
Claude-Session: https://claude.ai/code/session_01PwvPj41jSev9ApGi3qLq4f
</commit_message>
<xml_diff>
--- a/pmu-admissions-audit/email_package_v2/01_Admissions_Office_Pages_Revisit_Memo.docx
+++ b/pmu-admissions-audit/email_package_v2/01_Admissions_Office_Pages_Revisit_Memo.docx
@@ -810,7 +810,7 @@
                 <w:sz w:val="19"/>
                 <w:szCs w:val="19"/>
               </w:rPr>
-              <w:t xml:space="preserve">39 (Admissions page, 37 directly linked pages, application portal)</w:t>
+              <w:t xml:space="preserve">39 (Admissions page, 37 directly linked pages, application portal) + 3 supporting fee pages</w:t>
             </w:r>
           </w:p>
         </w:tc>
@@ -850,7 +850,7 @@
                 <w:sz w:val="19"/>
                 <w:szCs w:val="19"/>
               </w:rPr>
-              <w:t xml:space="preserve">Comments – linked pages</w:t>
+              <w:t xml:space="preserve">Content lines audited</w:t>
             </w:r>
           </w:p>
         </w:tc>
@@ -885,7 +885,7 @@
                 <w:sz w:val="19"/>
                 <w:szCs w:val="19"/>
               </w:rPr>
-              <w:t xml:space="preserve">51  (Priority 1: 6 · Priority 2: 29 · Priority 3: 16)</w:t>
+              <w:t xml:space="preserve">1,248 (incl. 257 lines hidden in tabs and 136 lines in the /apply page source)</w:t>
             </w:r>
           </w:p>
         </w:tc>
@@ -925,7 +925,7 @@
                 <w:sz w:val="19"/>
                 <w:szCs w:val="19"/>
               </w:rPr>
-              <w:t xml:space="preserve">Comments – legacy pages</w:t>
+              <w:t xml:space="preserve">Key findings – linked pages</w:t>
             </w:r>
           </w:p>
         </w:tc>
@@ -960,7 +960,157 @@
                 <w:sz w:val="19"/>
                 <w:szCs w:val="19"/>
               </w:rPr>
+              <w:t xml:space="preserve">61  (Priority 1: 6 · Priority 2: 32 · Priority 3: 23)</w:t>
+            </w:r>
+          </w:p>
+        </w:tc>
+      </w:tr>
+      <w:tr>
+        <w:trPr>
+          <w:cantSplit/>
+        </w:trPr>
+        <w:tc>
+          <w:tcPr>
+            <w:tcW w:type="dxa" w:w="3203"/>
+            <w:tcBorders>
+              <w:top w:val="single" w:color="BFBFBF" w:sz="4"/>
+              <w:left w:val="single" w:color="BFBFBF" w:sz="4"/>
+              <w:bottom w:val="single" w:color="BFBFBF" w:sz="4"/>
+              <w:right w:val="single" w:color="BFBFBF" w:sz="4"/>
+            </w:tcBorders>
+            <w:shd w:fill="FFFFFF" w:color="auto" w:val="clear"/>
+            <w:tcMar>
+              <w:top w:type="dxa" w:w="45"/>
+              <w:left w:type="dxa" w:w="100"/>
+              <w:bottom w:type="dxa" w:w="45"/>
+              <w:right w:type="dxa" w:w="100"/>
+            </w:tcMar>
+            <w:vAlign w:val="center"/>
+          </w:tcPr>
+          <w:p>
+            <w:pPr>
+              <w:jc w:val="left"/>
+            </w:pPr>
+            <w:r>
+              <w:rPr>
+                <w:rFonts w:ascii="Calibri" w:cs="Calibri" w:eastAsia="Calibri" w:hAnsi="Calibri"/>
+                <w:b/>
+                <w:bCs/>
+                <w:color w:val="262626"/>
+                <w:sz w:val="19"/>
+                <w:szCs w:val="19"/>
+              </w:rPr>
+              <w:t xml:space="preserve">Key findings – legacy pages</w:t>
+            </w:r>
+          </w:p>
+        </w:tc>
+        <w:tc>
+          <w:tcPr>
+            <w:tcW w:type="dxa" w:w="6435"/>
+            <w:tcBorders>
+              <w:top w:val="single" w:color="BFBFBF" w:sz="4"/>
+              <w:left w:val="single" w:color="BFBFBF" w:sz="4"/>
+              <w:bottom w:val="single" w:color="BFBFBF" w:sz="4"/>
+              <w:right w:val="single" w:color="BFBFBF" w:sz="4"/>
+            </w:tcBorders>
+            <w:shd w:fill="FFFFFF" w:color="auto" w:val="clear"/>
+            <w:tcMar>
+              <w:top w:type="dxa" w:w="45"/>
+              <w:left w:type="dxa" w:w="100"/>
+              <w:bottom w:type="dxa" w:w="45"/>
+              <w:right w:type="dxa" w:w="100"/>
+            </w:tcMar>
+            <w:vAlign w:val="center"/>
+          </w:tcPr>
+          <w:p>
+            <w:pPr>
+              <w:jc w:val="left"/>
+            </w:pPr>
+            <w:r>
+              <w:rPr>
+                <w:rFonts w:ascii="Calibri" w:cs="Calibri" w:eastAsia="Calibri" w:hAnsi="Calibri"/>
+                <w:b w:val="false"/>
+                <w:bCs w:val="false"/>
+                <w:color w:val="262626"/>
+                <w:sz w:val="19"/>
+                <w:szCs w:val="19"/>
+              </w:rPr>
               <w:t xml:space="preserve">10  (still online, not linked from the Admissions page)</w:t>
+            </w:r>
+          </w:p>
+        </w:tc>
+      </w:tr>
+      <w:tr>
+        <w:trPr>
+          <w:cantSplit/>
+        </w:trPr>
+        <w:tc>
+          <w:tcPr>
+            <w:tcW w:type="dxa" w:w="3203"/>
+            <w:tcBorders>
+              <w:top w:val="single" w:color="BFBFBF" w:sz="4"/>
+              <w:left w:val="single" w:color="BFBFBF" w:sz="4"/>
+              <w:bottom w:val="single" w:color="BFBFBF" w:sz="4"/>
+              <w:right w:val="single" w:color="BFBFBF" w:sz="4"/>
+            </w:tcBorders>
+            <w:shd w:fill="EAF1FB" w:color="auto" w:val="clear"/>
+            <w:tcMar>
+              <w:top w:type="dxa" w:w="45"/>
+              <w:left w:type="dxa" w:w="100"/>
+              <w:bottom w:type="dxa" w:w="45"/>
+              <w:right w:type="dxa" w:w="100"/>
+            </w:tcMar>
+            <w:vAlign w:val="center"/>
+          </w:tcPr>
+          <w:p>
+            <w:pPr>
+              <w:jc w:val="left"/>
+            </w:pPr>
+            <w:r>
+              <w:rPr>
+                <w:rFonts w:ascii="Calibri" w:cs="Calibri" w:eastAsia="Calibri" w:hAnsi="Calibri"/>
+                <w:b/>
+                <w:bCs/>
+                <w:color w:val="262626"/>
+                <w:sz w:val="19"/>
+                <w:szCs w:val="19"/>
+              </w:rPr>
+              <w:t xml:space="preserve">Detailed page-by-page notes</w:t>
+            </w:r>
+          </w:p>
+        </w:tc>
+        <w:tc>
+          <w:tcPr>
+            <w:tcW w:type="dxa" w:w="6435"/>
+            <w:tcBorders>
+              <w:top w:val="single" w:color="BFBFBF" w:sz="4"/>
+              <w:left w:val="single" w:color="BFBFBF" w:sz="4"/>
+              <w:bottom w:val="single" w:color="BFBFBF" w:sz="4"/>
+              <w:right w:val="single" w:color="BFBFBF" w:sz="4"/>
+            </w:tcBorders>
+            <w:shd w:fill="EAF1FB" w:color="auto" w:val="clear"/>
+            <w:tcMar>
+              <w:top w:type="dxa" w:w="45"/>
+              <w:left w:type="dxa" w:w="100"/>
+              <w:bottom w:type="dxa" w:w="45"/>
+              <w:right w:type="dxa" w:w="100"/>
+            </w:tcMar>
+            <w:vAlign w:val="center"/>
+          </w:tcPr>
+          <w:p>
+            <w:pPr>
+              <w:jc w:val="left"/>
+            </w:pPr>
+            <w:r>
+              <w:rPr>
+                <w:rFonts w:ascii="Calibri" w:cs="Calibri" w:eastAsia="Calibri" w:hAnsi="Calibri"/>
+                <w:b w:val="false"/>
+                <w:bCs w:val="false"/>
+                <w:color w:val="262626"/>
+                <w:sz w:val="19"/>
+                <w:szCs w:val="19"/>
+              </w:rPr>
+              <w:t xml:space="preserve">211 verified (169 confirmed, 42 partly confirmed)</w:t>
             </w:r>
           </w:p>
         </w:tc>
@@ -1136,7 +1286,7 @@
           <w:sz w:val="20"/>
           <w:szCs w:val="20"/>
         </w:rPr>
-        <w:t xml:space="preserve">Each amendment previously requested in the thread was re-checked against the live page.</w:t>
+        <w:t xml:space="preserve">Every content line (1,248) was given a review status, applicant segment and spelling/wording check; site-wide navigation was marked out of scope.</w:t>
       </w:r>
     </w:p>
     <w:p>
@@ -1155,13 +1305,52 @@
           <w:sz w:val="20"/>
           <w:szCs w:val="20"/>
         </w:rPr>
-        <w:t xml:space="preserve">Read-only: no page, form or payment was changed or submitted. The desktop view was not tested.</w:t>
+        <w:t xml:space="preserve">An earlier set of 214 detailed page notes was re-verified one by one against the captured pages: 169 confirmed, 42 partly confirmed, 3 not verifiable, none rejected.</w:t>
       </w:r>
     </w:p>
     <w:p>
       <w:pPr>
+        <w:pStyle w:val="ListParagraph"/>
+        <w:numPr>
+          <w:ilvl w:val="0"/>
+          <w:numId w:val="2"/>
+        </w:numPr>
+        <w:spacing w:after="80" w:line="276"/>
+      </w:pPr>
+      <w:r>
+        <w:rPr>
+          <w:rFonts w:ascii="Calibri" w:cs="Calibri" w:eastAsia="Calibri" w:hAnsi="Calibri"/>
+          <w:color w:val="262626"/>
+          <w:sz w:val="20"/>
+          <w:szCs w:val="20"/>
+        </w:rPr>
+        <w:t xml:space="preserve">Each amendment previously requested in the thread was re-checked against the live page.</w:t>
+      </w:r>
+    </w:p>
+    <w:p>
+      <w:pPr>
+        <w:pStyle w:val="ListParagraph"/>
+        <w:numPr>
+          <w:ilvl w:val="0"/>
+          <w:numId w:val="2"/>
+        </w:numPr>
+        <w:spacing w:after="80" w:line="276"/>
+      </w:pPr>
+      <w:r>
+        <w:rPr>
+          <w:rFonts w:ascii="Calibri" w:cs="Calibri" w:eastAsia="Calibri" w:hAnsi="Calibri"/>
+          <w:color w:val="262626"/>
+          <w:sz w:val="20"/>
+          <w:szCs w:val="20"/>
+        </w:rPr>
+        <w:t xml:space="preserve">Read-only: no page, form or payment was changed or submitted. The desktop view was not tested.</w:t>
+      </w:r>
+    </w:p>
+    <w:p>
+      <w:pPr>
         <w:pStyle w:val="Heading1"/>
         <w:keepNext/>
+        <w:pageBreakBefore/>
         <w:pBdr>
           <w:bottom w:val="single" w:color="2E75B6" w:sz="6" w:space="4"/>
         </w:pBdr>
@@ -2637,7 +2826,7 @@
           <w:sz w:val="20"/>
           <w:szCs w:val="20"/>
         </w:rPr>
-        <w:t xml:space="preserve">Ten decisions with proposed owners are listed in the attached register (sheet "Decisions required"). Pending values should not be published as policy until the relevant owner confirms them in writing. The main ones are:</w:t>
+        <w:t xml:space="preserve">Ten decisions with proposed owners are listed in the attached register (sheet "C. Decisions"). Pending values should not be published as policy until the relevant owner confirms them in writing. The main ones are:</w:t>
       </w:r>
     </w:p>
     <w:p>
@@ -2794,6 +2983,7 @@
       <w:pPr>
         <w:pStyle w:val="Heading1"/>
         <w:keepNext/>
+        <w:pageBreakBefore/>
         <w:pBdr>
           <w:bottom w:val="single" w:color="2E75B6" w:sz="6" w:space="4"/>
         </w:pBdr>
@@ -3043,7 +3233,7 @@
                 <w:sz w:val="19"/>
                 <w:szCs w:val="19"/>
               </w:rPr>
-              <w:t xml:space="preserve">Page-by-page comments with verbatim evidence and proposed change; decisions required; live status of previous requests.</w:t>
+              <w:t xml:space="preserve">Summary; A. key findings (71); B. page-by-page notes (211); C. decisions required; D. live status of previous requests.</w:t>
             </w:r>
           </w:p>
         </w:tc>
@@ -3153,7 +3343,7 @@
                 <w:sz w:val="19"/>
                 <w:szCs w:val="19"/>
               </w:rPr>
-              <w:t xml:space="preserve">Full extracted text of each page, for reference.</w:t>
+              <w:t xml:space="preserve">Every line of each page with its review status and cross-reference to the register (reference).</w:t>
             </w:r>
           </w:p>
         </w:tc>
@@ -3177,7 +3367,123 @@
           <w:sz w:val="26"/>
           <w:szCs w:val="26"/>
         </w:rPr>
-        <w:t xml:space="preserve">8. Limits</w:t>
+        <w:t xml:space="preserve">8. Other Notable Points from the Line-by-Line Review</w:t>
+      </w:r>
+    </w:p>
+    <w:p>
+      <w:pPr>
+        <w:pStyle w:val="ListParagraph"/>
+        <w:numPr>
+          <w:ilvl w:val="0"/>
+          <w:numId w:val="2"/>
+        </w:numPr>
+        <w:spacing w:after="80" w:line="276"/>
+      </w:pPr>
+      <w:r>
+        <w:rPr>
+          <w:rFonts w:ascii="Calibri" w:cs="Calibri" w:eastAsia="Calibri" w:hAnsi="Calibri"/>
+          <w:color w:val="262626"/>
+          <w:sz w:val="20"/>
+          <w:szCs w:val="20"/>
+        </w:rPr>
+        <w:t xml:space="preserve">"Contact Info" on undergraduate pages leads to the graduate-only contact page; "Contact Us" leads to the Student Affairs staff list.</w:t>
+      </w:r>
+    </w:p>
+    <w:p>
+      <w:pPr>
+        <w:pStyle w:val="ListParagraph"/>
+        <w:numPr>
+          <w:ilvl w:val="0"/>
+          <w:numId w:val="2"/>
+        </w:numPr>
+        <w:spacing w:after="80" w:line="276"/>
+      </w:pPr>
+      <w:r>
+        <w:rPr>
+          <w:rFonts w:ascii="Calibri" w:cs="Calibri" w:eastAsia="Calibri" w:hAnsi="Calibri"/>
+          <w:color w:val="262626"/>
+          <w:sz w:val="20"/>
+          <w:szCs w:val="20"/>
+        </w:rPr>
+        <w:t xml:space="preserve">The Aptis page says direct entry requires IELTS, while the TOEFL page and /apply also accept TOEFL iBT 83/19.</w:t>
+      </w:r>
+    </w:p>
+    <w:p>
+      <w:pPr>
+        <w:pStyle w:val="ListParagraph"/>
+        <w:numPr>
+          <w:ilvl w:val="0"/>
+          <w:numId w:val="2"/>
+        </w:numPr>
+        <w:spacing w:after="80" w:line="276"/>
+      </w:pPr>
+      <w:r>
+        <w:rPr>
+          <w:rFonts w:ascii="Calibri" w:cs="Calibri" w:eastAsia="Calibri" w:hAnsi="Calibri"/>
+          <w:color w:val="262626"/>
+          <w:sz w:val="20"/>
+          <w:szCs w:val="20"/>
+        </w:rPr>
+        <w:t xml:space="preserve">Inconsistent ID documents: "Saudi ID" only on some pages, "Saudi ID or Iqama" on others, and "National ID" for applicants without Saudi residence.</w:t>
+      </w:r>
+    </w:p>
+    <w:p>
+      <w:pPr>
+        <w:pStyle w:val="ListParagraph"/>
+        <w:numPr>
+          <w:ilvl w:val="0"/>
+          <w:numId w:val="2"/>
+        </w:numPr>
+        <w:spacing w:after="80" w:line="276"/>
+      </w:pPr>
+      <w:r>
+        <w:rPr>
+          <w:rFonts w:ascii="Calibri" w:cs="Calibri" w:eastAsia="Calibri" w:hAnsi="Calibri"/>
+          <w:color w:val="262626"/>
+          <w:sz w:val="20"/>
+          <w:szCs w:val="20"/>
+        </w:rPr>
+        <w:t xml:space="preserve">Graduate pages: "ADMISSSIONS" misspelt on six pages; the "(Very Good)" label is used for both 2.50 and 3.00 GPA minimums; MSEE, MSCE and MSID pages give no credit hours or application link.</w:t>
+      </w:r>
+    </w:p>
+    <w:p>
+      <w:pPr>
+        <w:pStyle w:val="ListParagraph"/>
+        <w:numPr>
+          <w:ilvl w:val="0"/>
+          <w:numId w:val="2"/>
+        </w:numPr>
+        <w:spacing w:after="80" w:line="276"/>
+      </w:pPr>
+      <w:r>
+        <w:rPr>
+          <w:rFonts w:ascii="Calibri" w:cs="Calibri" w:eastAsia="Calibri" w:hAnsi="Calibri"/>
+          <w:color w:val="262626"/>
+          <w:sz w:val="20"/>
+          <w:szCs w:val="20"/>
+        </w:rPr>
+        <w:t xml:space="preserve">The Academic Calendar link on Study @ PMU opens the 2023/2024 calendar; Orientation remains "TBA" after classes began on 30 August 2026.</w:t>
+      </w:r>
+    </w:p>
+    <w:p>
+      <w:pPr>
+        <w:pStyle w:val="Heading1"/>
+        <w:keepNext/>
+        <w:pBdr>
+          <w:bottom w:val="single" w:color="2E75B6" w:sz="6" w:space="4"/>
+        </w:pBdr>
+        <w:spacing w:after="90" w:before="200"/>
+      </w:pPr>
+      <w:r>
+        <w:rPr>
+          <w:rFonts w:ascii="Calibri" w:cs="Calibri" w:eastAsia="Calibri" w:hAnsi="Calibri"/>
+          <w:b/>
+          <w:bCs/>
+          <w:color w:val="1F3864"/>
+          <w:sz w:val="26"/>
+          <w:szCs w:val="26"/>
+        </w:rPr>
+        <w:t xml:space="preserve">9. Limits</w:t>
       </w:r>
     </w:p>
     <w:p>

</xml_diff>